<commit_message>
doc. improve the link of detailed info for kubectl as of 2023-07-05.
</commit_message>
<xml_diff>
--- a/kubernetes/cheat sheet.docx
+++ b/kubernetes/cheat sheet.docx
@@ -1,6 +1,6 @@
 
 <file path=word/document.xml><?xml version="1.0" encoding="utf-8"?>
-<w:document xmlns:wpc="http://schemas.microsoft.com/office/word/2010/wordprocessingCanvas" xmlns:cx="http://schemas.microsoft.com/office/drawing/2014/chartex" xmlns:cx1="http://schemas.microsoft.com/office/drawing/2015/9/8/chartex" xmlns:cx2="http://schemas.microsoft.com/office/drawing/2015/10/21/chartex" xmlns:cx3="http://schemas.microsoft.com/office/drawing/2016/5/9/chartex" xmlns:cx4="http://schemas.microsoft.com/office/drawing/2016/5/10/chartex" xmlns:cx5="http://schemas.microsoft.com/office/drawing/2016/5/11/chartex" xmlns:cx6="http://schemas.microsoft.com/office/drawing/2016/5/12/chartex" xmlns:cx7="http://schemas.microsoft.com/office/drawing/2016/5/13/chartex" xmlns:cx8="http://schemas.microsoft.com/office/drawing/2016/5/14/chartex" xmlns:mc="http://schemas.openxmlformats.org/markup-compatibility/2006" xmlns:aink="http://schemas.microsoft.com/office/drawing/2016/ink" xmlns:am3d="http://schemas.microsoft.com/office/drawing/2017/model3d" xmlns:o="urn:schemas-microsoft-com:office:office" xmlns:r="http://schemas.openxmlformats.org/officeDocument/2006/relationships" xmlns:m="http://schemas.openxmlformats.org/officeDocument/2006/math" xmlns:v="urn:schemas-microsoft-com:vml" xmlns:wp14="http://schemas.microsoft.com/office/word/2010/wordprocessingDrawing" xmlns:wp="http://schemas.openxmlformats.org/drawingml/2006/wordprocessingDrawing" xmlns:w10="urn:schemas-microsoft-com:office:word" xmlns:w="http://schemas.openxmlformats.org/wordprocessingml/2006/main" xmlns:w14="http://schemas.microsoft.com/office/word/2010/wordml" xmlns:w15="http://schemas.microsoft.com/office/word/2012/wordml" xmlns:w16cid="http://schemas.microsoft.com/office/word/2016/wordml/cid" xmlns:w16se="http://schemas.microsoft.com/office/word/2015/wordml/symex" xmlns:wpg="http://schemas.microsoft.com/office/word/2010/wordprocessingGroup" xmlns:wpi="http://schemas.microsoft.com/office/word/2010/wordprocessingInk" xmlns:wne="http://schemas.microsoft.com/office/word/2006/wordml" xmlns:wps="http://schemas.microsoft.com/office/word/2010/wordprocessingShape" mc:Ignorable="w14 w15 w16se w16cid wp14">
+<w:document xmlns:wpc="http://schemas.microsoft.com/office/word/2010/wordprocessingCanvas" xmlns:cx="http://schemas.microsoft.com/office/drawing/2014/chartex" xmlns:cx1="http://schemas.microsoft.com/office/drawing/2015/9/8/chartex" xmlns:cx2="http://schemas.microsoft.com/office/drawing/2015/10/21/chartex" xmlns:cx3="http://schemas.microsoft.com/office/drawing/2016/5/9/chartex" xmlns:cx4="http://schemas.microsoft.com/office/drawing/2016/5/10/chartex" xmlns:cx5="http://schemas.microsoft.com/office/drawing/2016/5/11/chartex" xmlns:cx6="http://schemas.microsoft.com/office/drawing/2016/5/12/chartex" xmlns:cx7="http://schemas.microsoft.com/office/drawing/2016/5/13/chartex" xmlns:cx8="http://schemas.microsoft.com/office/drawing/2016/5/14/chartex" xmlns:mc="http://schemas.openxmlformats.org/markup-compatibility/2006" xmlns:aink="http://schemas.microsoft.com/office/drawing/2016/ink" xmlns:am3d="http://schemas.microsoft.com/office/drawing/2017/model3d" xmlns:o="urn:schemas-microsoft-com:office:office" xmlns:oel="http://schemas.microsoft.com/office/2019/extlst" xmlns:r="http://schemas.openxmlformats.org/officeDocument/2006/relationships" xmlns:m="http://schemas.openxmlformats.org/officeDocument/2006/math" xmlns:v="urn:schemas-microsoft-com:vml" xmlns:wp14="http://schemas.microsoft.com/office/word/2010/wordprocessingDrawing" xmlns:wp="http://schemas.openxmlformats.org/drawingml/2006/wordprocessingDrawing" xmlns:w10="urn:schemas-microsoft-com:office:word" xmlns:w="http://schemas.openxmlformats.org/wordprocessingml/2006/main" xmlns:w14="http://schemas.microsoft.com/office/word/2010/wordml" xmlns:w15="http://schemas.microsoft.com/office/word/2012/wordml" xmlns:w16cex="http://schemas.microsoft.com/office/word/2018/wordml/cex" xmlns:w16cid="http://schemas.microsoft.com/office/word/2016/wordml/cid" xmlns:w16="http://schemas.microsoft.com/office/word/2018/wordml" xmlns:w16sdtdh="http://schemas.microsoft.com/office/word/2020/wordml/sdtdatahash" xmlns:w16se="http://schemas.microsoft.com/office/word/2015/wordml/symex" xmlns:wpg="http://schemas.microsoft.com/office/word/2010/wordprocessingGroup" xmlns:wpi="http://schemas.microsoft.com/office/word/2010/wordprocessingInk" xmlns:wne="http://schemas.microsoft.com/office/word/2006/wordml" xmlns:wps="http://schemas.microsoft.com/office/word/2010/wordprocessingShape" mc:Ignorable="w14 w15 w16se w16cid w16 w16cex w16sdtdh wp14">
   <w:body>
     <w:p>
       <w:pPr>
@@ -51,7 +51,6 @@
           <w:lang w:val="en-US" w:eastAsia="de-DE"/>
         </w:rPr>
       </w:pPr>
-      <w:proofErr w:type="spellStart"/>
       <w:r>
         <w:rPr>
           <w:rFonts w:ascii="Segoe UI" w:eastAsia="Times New Roman" w:hAnsi="Segoe UI" w:cs="Segoe UI"/>
@@ -62,45 +61,30 @@
           <w:szCs w:val="36"/>
           <w:lang w:val="en-US" w:eastAsia="de-DE"/>
         </w:rPr>
+        <w:t>kubectl syntax</w:t>
+      </w:r>
+    </w:p>
+    <w:p>
+      <w:pPr>
+        <w:spacing w:after="0" w:line="240" w:lineRule="auto"/>
+        <w:rPr>
+          <w:rFonts w:ascii="Segoe UI" w:eastAsia="Times New Roman" w:hAnsi="Segoe UI" w:cs="Segoe UI"/>
+          <w:color w:val="24292E"/>
+          <w:sz w:val="20"/>
+          <w:szCs w:val="20"/>
+          <w:lang w:val="en-US" w:eastAsia="de-DE"/>
+        </w:rPr>
+      </w:pPr>
+      <w:r>
+        <w:rPr>
+          <w:rFonts w:ascii="Consolas" w:eastAsia="Times New Roman" w:hAnsi="Consolas" w:cs="Courier New"/>
+          <w:color w:val="24292E"/>
+          <w:sz w:val="20"/>
+          <w:szCs w:val="20"/>
+          <w:lang w:val="en-US" w:eastAsia="de-DE"/>
+        </w:rPr>
         <w:t>kubectl</w:t>
       </w:r>
-      <w:proofErr w:type="spellEnd"/>
-      <w:r>
-        <w:rPr>
-          <w:rFonts w:ascii="Segoe UI" w:eastAsia="Times New Roman" w:hAnsi="Segoe UI" w:cs="Segoe UI"/>
-          <w:b/>
-          <w:bCs/>
-          <w:color w:val="24292E"/>
-          <w:sz w:val="32"/>
-          <w:szCs w:val="36"/>
-          <w:lang w:val="en-US" w:eastAsia="de-DE"/>
-        </w:rPr>
-        <w:t xml:space="preserve"> syntax</w:t>
-      </w:r>
-    </w:p>
-    <w:p>
-      <w:pPr>
-        <w:spacing w:after="0" w:line="240" w:lineRule="auto"/>
-        <w:rPr>
-          <w:rFonts w:ascii="Segoe UI" w:eastAsia="Times New Roman" w:hAnsi="Segoe UI" w:cs="Segoe UI"/>
-          <w:color w:val="24292E"/>
-          <w:sz w:val="20"/>
-          <w:szCs w:val="20"/>
-          <w:lang w:val="en-US" w:eastAsia="de-DE"/>
-        </w:rPr>
-      </w:pPr>
-      <w:proofErr w:type="spellStart"/>
-      <w:r>
-        <w:rPr>
-          <w:rFonts w:ascii="Consolas" w:eastAsia="Times New Roman" w:hAnsi="Consolas" w:cs="Courier New"/>
-          <w:color w:val="24292E"/>
-          <w:sz w:val="20"/>
-          <w:szCs w:val="20"/>
-          <w:lang w:val="en-US" w:eastAsia="de-DE"/>
-        </w:rPr>
-        <w:t>kubectl</w:t>
-      </w:r>
-      <w:proofErr w:type="spellEnd"/>
       <w:r>
         <w:rPr>
           <w:rFonts w:ascii="Segoe UI" w:eastAsia="Times New Roman" w:hAnsi="Segoe UI" w:cs="Segoe UI"/>
@@ -175,29 +159,7 @@
           <w:szCs w:val="20"/>
           <w:lang w:val="en-US" w:eastAsia="de-DE"/>
         </w:rPr>
-        <w:t xml:space="preserve"> - tells </w:t>
-      </w:r>
-      <w:proofErr w:type="spellStart"/>
-      <w:r>
-        <w:rPr>
-          <w:rFonts w:ascii="Segoe UI" w:eastAsia="Times New Roman" w:hAnsi="Segoe UI" w:cs="Segoe UI"/>
-          <w:color w:val="24292E"/>
-          <w:sz w:val="20"/>
-          <w:szCs w:val="20"/>
-          <w:lang w:val="en-US" w:eastAsia="de-DE"/>
-        </w:rPr>
-        <w:t>kubectl</w:t>
-      </w:r>
-      <w:proofErr w:type="spellEnd"/>
-      <w:r>
-        <w:rPr>
-          <w:rFonts w:ascii="Segoe UI" w:eastAsia="Times New Roman" w:hAnsi="Segoe UI" w:cs="Segoe UI"/>
-          <w:color w:val="24292E"/>
-          <w:sz w:val="20"/>
-          <w:szCs w:val="20"/>
-          <w:lang w:val="en-US" w:eastAsia="de-DE"/>
-        </w:rPr>
-        <w:t xml:space="preserve"> what to do.</w:t>
+        <w:t xml:space="preserve"> - tells kubectl what to do.</w:t>
       </w:r>
     </w:p>
     <w:p>
@@ -409,7 +371,6 @@
         </w:rPr>
         <w:t>: more detailed output. The flag also accepts </w:t>
       </w:r>
-      <w:proofErr w:type="spellStart"/>
       <w:r>
         <w:rPr>
           <w:rFonts w:ascii="Consolas" w:eastAsia="Times New Roman" w:hAnsi="Consolas" w:cs="Courier New"/>
@@ -420,7 +381,6 @@
         </w:rPr>
         <w:t>yaml</w:t>
       </w:r>
-      <w:proofErr w:type="spellEnd"/>
       <w:r>
         <w:rPr>
           <w:rFonts w:ascii="Segoe UI" w:eastAsia="Times New Roman" w:hAnsi="Segoe UI" w:cs="Segoe UI"/>
@@ -473,7 +433,6 @@
         </w:rPr>
         <w:t>Example: </w:t>
       </w:r>
-      <w:proofErr w:type="spellStart"/>
       <w:r>
         <w:rPr>
           <w:rFonts w:ascii="Consolas" w:eastAsia="Times New Roman" w:hAnsi="Consolas" w:cs="Courier New"/>
@@ -482,32 +441,19 @@
           <w:szCs w:val="20"/>
           <w:lang w:val="en-US" w:eastAsia="de-DE"/>
         </w:rPr>
-        <w:t>kubectl</w:t>
-      </w:r>
-      <w:proofErr w:type="spellEnd"/>
-      <w:r>
+        <w:t>kubectl get pod -n=my-namespace -o=wide</w:t>
+      </w:r>
+    </w:p>
+    <w:p>
+      <w:pPr>
+        <w:spacing w:after="0" w:line="240" w:lineRule="auto"/>
         <w:rPr>
           <w:rFonts w:ascii="Consolas" w:eastAsia="Times New Roman" w:hAnsi="Consolas" w:cs="Courier New"/>
           <w:color w:val="24292E"/>
-          <w:sz w:val="20"/>
-          <w:szCs w:val="20"/>
-          <w:lang w:val="en-US" w:eastAsia="de-DE"/>
-        </w:rPr>
-        <w:t xml:space="preserve"> get pod -n=my-namespace -o=wide</w:t>
-      </w:r>
-    </w:p>
-    <w:p>
-      <w:pPr>
-        <w:spacing w:after="0" w:line="240" w:lineRule="auto"/>
-        <w:rPr>
-          <w:rFonts w:ascii="Consolas" w:eastAsia="Times New Roman" w:hAnsi="Consolas" w:cs="Courier New"/>
-          <w:color w:val="24292E"/>
           <w:szCs w:val="24"/>
           <w:lang w:val="en-US" w:eastAsia="de-DE"/>
         </w:rPr>
       </w:pPr>
-      <w:bookmarkStart w:id="0" w:name="_GoBack"/>
-      <w:bookmarkEnd w:id="0"/>
     </w:p>
     <w:p>
       <w:pPr>
@@ -550,27 +496,15 @@
           <w:lang w:val="en-US" w:eastAsia="de-DE"/>
         </w:rPr>
       </w:pPr>
-      <w:proofErr w:type="spellStart"/>
-      <w:r>
-        <w:rPr>
-          <w:rFonts w:ascii="Segoe UI" w:eastAsia="Times New Roman" w:hAnsi="Segoe UI" w:cs="Segoe UI"/>
-          <w:color w:val="24292E"/>
-          <w:sz w:val="20"/>
-          <w:szCs w:val="20"/>
-          <w:lang w:val="en-US" w:eastAsia="de-DE"/>
-        </w:rPr>
-        <w:t>kubectl</w:t>
-      </w:r>
-      <w:proofErr w:type="spellEnd"/>
-      <w:r>
-        <w:rPr>
-          <w:rFonts w:ascii="Segoe UI" w:eastAsia="Times New Roman" w:hAnsi="Segoe UI" w:cs="Segoe UI"/>
-          <w:color w:val="24292E"/>
-          <w:sz w:val="20"/>
-          <w:szCs w:val="20"/>
-          <w:lang w:val="en-US" w:eastAsia="de-DE"/>
-        </w:rPr>
-        <w:t xml:space="preserve"> wants you to reference resources by type. To do so, there are different formats available.</w:t>
+      <w:r>
+        <w:rPr>
+          <w:rFonts w:ascii="Segoe UI" w:eastAsia="Times New Roman" w:hAnsi="Segoe UI" w:cs="Segoe UI"/>
+          <w:color w:val="24292E"/>
+          <w:sz w:val="20"/>
+          <w:szCs w:val="20"/>
+          <w:lang w:val="en-US" w:eastAsia="de-DE"/>
+        </w:rPr>
+        <w:t>kubectl wants you to reference resources by type. To do so, there are different formats available.</w:t>
       </w:r>
     </w:p>
     <w:p>
@@ -606,7 +540,6 @@
         </w:rPr>
         <w:t>Most common is the following:  </w:t>
       </w:r>
-      <w:proofErr w:type="spellStart"/>
       <w:r>
         <w:rPr>
           <w:rFonts w:ascii="Consolas" w:eastAsia="Times New Roman" w:hAnsi="Consolas" w:cs="Courier New"/>
@@ -615,9 +548,30 @@
           <w:szCs w:val="20"/>
           <w:lang w:val="en-US" w:eastAsia="de-DE"/>
         </w:rPr>
-        <w:t>kubectl</w:t>
-      </w:r>
-      <w:proofErr w:type="spellEnd"/>
+        <w:t>kubectl &lt;verb&gt; &lt;resource type&gt; &lt;name&gt;</w:t>
+      </w:r>
+    </w:p>
+    <w:p>
+      <w:pPr>
+        <w:spacing w:after="0" w:line="240" w:lineRule="auto"/>
+        <w:rPr>
+          <w:rFonts w:ascii="Segoe UI" w:eastAsia="Times New Roman" w:hAnsi="Segoe UI" w:cs="Segoe UI"/>
+          <w:color w:val="24292E"/>
+          <w:sz w:val="20"/>
+          <w:szCs w:val="20"/>
+          <w:lang w:val="en-US" w:eastAsia="de-DE"/>
+        </w:rPr>
+      </w:pPr>
+      <w:r>
+        <w:rPr>
+          <w:rFonts w:ascii="Segoe UI" w:eastAsia="Times New Roman" w:hAnsi="Segoe UI" w:cs="Segoe UI"/>
+          <w:color w:val="24292E"/>
+          <w:sz w:val="20"/>
+          <w:szCs w:val="20"/>
+          <w:lang w:val="en-US" w:eastAsia="de-DE"/>
+        </w:rPr>
+        <w:t xml:space="preserve">Example: </w:t>
+      </w:r>
       <w:r>
         <w:rPr>
           <w:rFonts w:ascii="Consolas" w:eastAsia="Times New Roman" w:hAnsi="Consolas" w:cs="Courier New"/>
@@ -626,7 +580,7 @@
           <w:szCs w:val="20"/>
           <w:lang w:val="en-US" w:eastAsia="de-DE"/>
         </w:rPr>
-        <w:t xml:space="preserve"> &lt;verb&gt; &lt;resource type&gt; &lt;name&gt;</w:t>
+        <w:t>kubectl get deployment nginx</w:t>
       </w:r>
     </w:p>
     <w:p>
@@ -640,17 +594,28 @@
           <w:lang w:val="en-US" w:eastAsia="de-DE"/>
         </w:rPr>
       </w:pPr>
-      <w:r>
-        <w:rPr>
-          <w:rFonts w:ascii="Segoe UI" w:eastAsia="Times New Roman" w:hAnsi="Segoe UI" w:cs="Segoe UI"/>
-          <w:color w:val="24292E"/>
-          <w:sz w:val="20"/>
-          <w:szCs w:val="20"/>
-          <w:lang w:val="en-US" w:eastAsia="de-DE"/>
-        </w:rPr>
-        <w:t xml:space="preserve">Example: </w:t>
-      </w:r>
-      <w:proofErr w:type="spellStart"/>
+    </w:p>
+    <w:p>
+      <w:pPr>
+        <w:spacing w:after="0" w:line="240" w:lineRule="auto"/>
+        <w:rPr>
+          <w:rFonts w:ascii="Segoe UI" w:eastAsia="Times New Roman" w:hAnsi="Segoe UI" w:cs="Segoe UI"/>
+          <w:color w:val="24292E"/>
+          <w:sz w:val="20"/>
+          <w:szCs w:val="20"/>
+          <w:lang w:val="en-US" w:eastAsia="de-DE"/>
+        </w:rPr>
+      </w:pPr>
+      <w:r>
+        <w:rPr>
+          <w:rFonts w:ascii="Segoe UI" w:eastAsia="Times New Roman" w:hAnsi="Segoe UI" w:cs="Segoe UI"/>
+          <w:color w:val="24292E"/>
+          <w:sz w:val="20"/>
+          <w:szCs w:val="20"/>
+          <w:lang w:val="en-US" w:eastAsia="de-DE"/>
+        </w:rPr>
+        <w:t>However, it is also possible to concatenate resource type and name like this: </w:t>
+      </w:r>
       <w:r>
         <w:rPr>
           <w:rFonts w:ascii="Consolas" w:eastAsia="Times New Roman" w:hAnsi="Consolas" w:cs="Courier New"/>
@@ -659,9 +624,52 @@
           <w:szCs w:val="20"/>
           <w:lang w:val="en-US" w:eastAsia="de-DE"/>
         </w:rPr>
-        <w:t>kubectl</w:t>
-      </w:r>
-      <w:proofErr w:type="spellEnd"/>
+        <w:t>deployment/nginx</w:t>
+      </w:r>
+      <w:r>
+        <w:rPr>
+          <w:rFonts w:ascii="Segoe UI" w:eastAsia="Times New Roman" w:hAnsi="Segoe UI" w:cs="Segoe UI"/>
+          <w:color w:val="24292E"/>
+          <w:sz w:val="20"/>
+          <w:szCs w:val="20"/>
+          <w:lang w:val="en-US" w:eastAsia="de-DE"/>
+        </w:rPr>
+        <w:t>.</w:t>
+      </w:r>
+    </w:p>
+    <w:p>
+      <w:pPr>
+        <w:spacing w:after="0" w:line="240" w:lineRule="auto"/>
+        <w:rPr>
+          <w:rFonts w:ascii="Segoe UI" w:eastAsia="Times New Roman" w:hAnsi="Segoe UI" w:cs="Segoe UI"/>
+          <w:color w:val="24292E"/>
+          <w:sz w:val="20"/>
+          <w:szCs w:val="20"/>
+          <w:lang w:val="en-US" w:eastAsia="de-DE"/>
+        </w:rPr>
+      </w:pPr>
+    </w:p>
+    <w:p>
+      <w:pPr>
+        <w:spacing w:after="100" w:afterAutospacing="1" w:line="240" w:lineRule="auto"/>
+        <w:rPr>
+          <w:rFonts w:ascii="Segoe UI" w:eastAsia="Times New Roman" w:hAnsi="Segoe UI" w:cs="Segoe UI"/>
+          <w:color w:val="24292E"/>
+          <w:sz w:val="20"/>
+          <w:szCs w:val="20"/>
+          <w:lang w:val="en-US" w:eastAsia="de-DE"/>
+        </w:rPr>
+      </w:pPr>
+      <w:r>
+        <w:rPr>
+          <w:rFonts w:ascii="Segoe UI" w:eastAsia="Times New Roman" w:hAnsi="Segoe UI" w:cs="Segoe UI"/>
+          <w:color w:val="24292E"/>
+          <w:sz w:val="20"/>
+          <w:szCs w:val="20"/>
+          <w:lang w:val="en-US" w:eastAsia="de-DE"/>
+        </w:rPr>
+        <w:t>For several of the resource types there are also shortened identifiers available. For example, the type </w:t>
+      </w:r>
       <w:r>
         <w:rPr>
           <w:rFonts w:ascii="Consolas" w:eastAsia="Times New Roman" w:hAnsi="Consolas" w:cs="Courier New"/>
@@ -670,9 +678,18 @@
           <w:szCs w:val="20"/>
           <w:lang w:val="en-US" w:eastAsia="de-DE"/>
         </w:rPr>
-        <w:t xml:space="preserve"> get deployment </w:t>
-      </w:r>
-      <w:proofErr w:type="spellStart"/>
+        <w:t>service</w:t>
+      </w:r>
+      <w:r>
+        <w:rPr>
+          <w:rFonts w:ascii="Segoe UI" w:eastAsia="Times New Roman" w:hAnsi="Segoe UI" w:cs="Segoe UI"/>
+          <w:color w:val="24292E"/>
+          <w:sz w:val="20"/>
+          <w:szCs w:val="20"/>
+          <w:lang w:val="en-US" w:eastAsia="de-DE"/>
+        </w:rPr>
+        <w:t> can be referenced by </w:t>
+      </w:r>
       <w:r>
         <w:rPr>
           <w:rFonts w:ascii="Consolas" w:eastAsia="Times New Roman" w:hAnsi="Consolas" w:cs="Courier New"/>
@@ -681,137 +698,6 @@
           <w:szCs w:val="20"/>
           <w:lang w:val="en-US" w:eastAsia="de-DE"/>
         </w:rPr>
-        <w:t>nginx</w:t>
-      </w:r>
-      <w:proofErr w:type="spellEnd"/>
-    </w:p>
-    <w:p>
-      <w:pPr>
-        <w:spacing w:after="0" w:line="240" w:lineRule="auto"/>
-        <w:rPr>
-          <w:rFonts w:ascii="Segoe UI" w:eastAsia="Times New Roman" w:hAnsi="Segoe UI" w:cs="Segoe UI"/>
-          <w:color w:val="24292E"/>
-          <w:sz w:val="20"/>
-          <w:szCs w:val="20"/>
-          <w:lang w:val="en-US" w:eastAsia="de-DE"/>
-        </w:rPr>
-      </w:pPr>
-    </w:p>
-    <w:p>
-      <w:pPr>
-        <w:spacing w:after="0" w:line="240" w:lineRule="auto"/>
-        <w:rPr>
-          <w:rFonts w:ascii="Segoe UI" w:eastAsia="Times New Roman" w:hAnsi="Segoe UI" w:cs="Segoe UI"/>
-          <w:color w:val="24292E"/>
-          <w:sz w:val="20"/>
-          <w:szCs w:val="20"/>
-          <w:lang w:val="en-US" w:eastAsia="de-DE"/>
-        </w:rPr>
-      </w:pPr>
-      <w:r>
-        <w:rPr>
-          <w:rFonts w:ascii="Segoe UI" w:eastAsia="Times New Roman" w:hAnsi="Segoe UI" w:cs="Segoe UI"/>
-          <w:color w:val="24292E"/>
-          <w:sz w:val="20"/>
-          <w:szCs w:val="20"/>
-          <w:lang w:val="en-US" w:eastAsia="de-DE"/>
-        </w:rPr>
-        <w:t>However, it is also possible to concatenate resource type and name like this: </w:t>
-      </w:r>
-      <w:r>
-        <w:rPr>
-          <w:rFonts w:ascii="Consolas" w:eastAsia="Times New Roman" w:hAnsi="Consolas" w:cs="Courier New"/>
-          <w:color w:val="24292E"/>
-          <w:sz w:val="20"/>
-          <w:szCs w:val="20"/>
-          <w:lang w:val="en-US" w:eastAsia="de-DE"/>
-        </w:rPr>
-        <w:t>deployment/</w:t>
-      </w:r>
-      <w:proofErr w:type="spellStart"/>
-      <w:r>
-        <w:rPr>
-          <w:rFonts w:ascii="Consolas" w:eastAsia="Times New Roman" w:hAnsi="Consolas" w:cs="Courier New"/>
-          <w:color w:val="24292E"/>
-          <w:sz w:val="20"/>
-          <w:szCs w:val="20"/>
-          <w:lang w:val="en-US" w:eastAsia="de-DE"/>
-        </w:rPr>
-        <w:t>nginx</w:t>
-      </w:r>
-      <w:proofErr w:type="spellEnd"/>
-      <w:r>
-        <w:rPr>
-          <w:rFonts w:ascii="Segoe UI" w:eastAsia="Times New Roman" w:hAnsi="Segoe UI" w:cs="Segoe UI"/>
-          <w:color w:val="24292E"/>
-          <w:sz w:val="20"/>
-          <w:szCs w:val="20"/>
-          <w:lang w:val="en-US" w:eastAsia="de-DE"/>
-        </w:rPr>
-        <w:t>.</w:t>
-      </w:r>
-    </w:p>
-    <w:p>
-      <w:pPr>
-        <w:spacing w:after="0" w:line="240" w:lineRule="auto"/>
-        <w:rPr>
-          <w:rFonts w:ascii="Segoe UI" w:eastAsia="Times New Roman" w:hAnsi="Segoe UI" w:cs="Segoe UI"/>
-          <w:color w:val="24292E"/>
-          <w:sz w:val="20"/>
-          <w:szCs w:val="20"/>
-          <w:lang w:val="en-US" w:eastAsia="de-DE"/>
-        </w:rPr>
-      </w:pPr>
-    </w:p>
-    <w:p>
-      <w:pPr>
-        <w:spacing w:after="100" w:afterAutospacing="1" w:line="240" w:lineRule="auto"/>
-        <w:rPr>
-          <w:rFonts w:ascii="Segoe UI" w:eastAsia="Times New Roman" w:hAnsi="Segoe UI" w:cs="Segoe UI"/>
-          <w:color w:val="24292E"/>
-          <w:sz w:val="20"/>
-          <w:szCs w:val="20"/>
-          <w:lang w:val="en-US" w:eastAsia="de-DE"/>
-        </w:rPr>
-      </w:pPr>
-      <w:r>
-        <w:rPr>
-          <w:rFonts w:ascii="Segoe UI" w:eastAsia="Times New Roman" w:hAnsi="Segoe UI" w:cs="Segoe UI"/>
-          <w:color w:val="24292E"/>
-          <w:sz w:val="20"/>
-          <w:szCs w:val="20"/>
-          <w:lang w:val="en-US" w:eastAsia="de-DE"/>
-        </w:rPr>
-        <w:t>For several of the resource types there are also shortened identifiers available. For example, the type </w:t>
-      </w:r>
-      <w:r>
-        <w:rPr>
-          <w:rFonts w:ascii="Consolas" w:eastAsia="Times New Roman" w:hAnsi="Consolas" w:cs="Courier New"/>
-          <w:color w:val="24292E"/>
-          <w:sz w:val="20"/>
-          <w:szCs w:val="20"/>
-          <w:lang w:val="en-US" w:eastAsia="de-DE"/>
-        </w:rPr>
-        <w:t>service</w:t>
-      </w:r>
-      <w:r>
-        <w:rPr>
-          <w:rFonts w:ascii="Segoe UI" w:eastAsia="Times New Roman" w:hAnsi="Segoe UI" w:cs="Segoe UI"/>
-          <w:color w:val="24292E"/>
-          <w:sz w:val="20"/>
-          <w:szCs w:val="20"/>
-          <w:lang w:val="en-US" w:eastAsia="de-DE"/>
-        </w:rPr>
-        <w:t> can be referenced by </w:t>
-      </w:r>
-      <w:r>
-        <w:rPr>
-          <w:rFonts w:ascii="Consolas" w:eastAsia="Times New Roman" w:hAnsi="Consolas" w:cs="Courier New"/>
-          <w:color w:val="24292E"/>
-          <w:sz w:val="20"/>
-          <w:szCs w:val="20"/>
-          <w:lang w:val="en-US" w:eastAsia="de-DE"/>
-        </w:rPr>
         <w:t>svc</w:t>
       </w:r>
       <w:r>
@@ -824,7 +710,7 @@
         </w:rPr>
         <w:t xml:space="preserve">. A full list is available at </w:t>
       </w:r>
-      <w:hyperlink r:id="rId6" w:history="1">
+      <w:hyperlink r:id="rId8" w:history="1">
         <w:r>
           <w:rPr>
             <w:rStyle w:val="Hyperlink"/>
@@ -833,7 +719,7 @@
             <w:szCs w:val="20"/>
             <w:lang w:val="en-US" w:eastAsia="de-DE"/>
           </w:rPr>
-          <w:t>https://kubernetes.io/docs/user-guide/kubectl-overview</w:t>
+          <w:t>https://kubernetes.io/docs/reference/kubectl/</w:t>
         </w:r>
       </w:hyperlink>
       <w:r>
@@ -876,29 +762,7 @@
           <w:szCs w:val="20"/>
           <w:lang w:val="en-US" w:eastAsia="de-DE"/>
         </w:rPr>
-        <w:t xml:space="preserve">To get a list of all resources of a cluster including their </w:t>
-      </w:r>
-      <w:proofErr w:type="spellStart"/>
-      <w:r>
-        <w:rPr>
-          <w:rFonts w:ascii="Segoe UI" w:eastAsia="Times New Roman" w:hAnsi="Segoe UI" w:cs="Segoe UI"/>
-          <w:color w:val="24292E"/>
-          <w:sz w:val="20"/>
-          <w:szCs w:val="20"/>
-          <w:lang w:val="en-US" w:eastAsia="de-DE"/>
-        </w:rPr>
-        <w:t>shortnames</w:t>
-      </w:r>
-      <w:proofErr w:type="spellEnd"/>
-      <w:r>
-        <w:rPr>
-          <w:rFonts w:ascii="Segoe UI" w:eastAsia="Times New Roman" w:hAnsi="Segoe UI" w:cs="Segoe UI"/>
-          <w:color w:val="24292E"/>
-          <w:sz w:val="20"/>
-          <w:szCs w:val="20"/>
-          <w:lang w:val="en-US" w:eastAsia="de-DE"/>
-        </w:rPr>
-        <w:t xml:space="preserve"> run:</w:t>
+        <w:t>To get a list of all resources of a cluster including their shortnames run:</w:t>
       </w:r>
       <w:r>
         <w:rPr>
@@ -910,7 +774,6 @@
         </w:rPr>
         <w:t xml:space="preserve"> </w:t>
       </w:r>
-      <w:proofErr w:type="spellStart"/>
       <w:r>
         <w:rPr>
           <w:rFonts w:ascii="Consolas" w:eastAsia="Times New Roman" w:hAnsi="Consolas" w:cs="Times New Roman"/>
@@ -918,37 +781,7 @@
           <w:szCs w:val="20"/>
           <w:lang w:val="en-US" w:eastAsia="de-DE"/>
         </w:rPr>
-        <w:t>kubectl</w:t>
-      </w:r>
-      <w:proofErr w:type="spellEnd"/>
-      <w:r>
-        <w:rPr>
-          <w:rFonts w:ascii="Consolas" w:eastAsia="Times New Roman" w:hAnsi="Consolas" w:cs="Times New Roman"/>
-          <w:sz w:val="20"/>
-          <w:szCs w:val="20"/>
-          <w:lang w:val="en-US" w:eastAsia="de-DE"/>
-        </w:rPr>
-        <w:t xml:space="preserve"> </w:t>
-      </w:r>
-      <w:proofErr w:type="spellStart"/>
-      <w:r>
-        <w:rPr>
-          <w:rFonts w:ascii="Consolas" w:eastAsia="Times New Roman" w:hAnsi="Consolas" w:cs="Times New Roman"/>
-          <w:sz w:val="20"/>
-          <w:szCs w:val="20"/>
-          <w:lang w:val="en-US" w:eastAsia="de-DE"/>
-        </w:rPr>
-        <w:t>api</w:t>
-      </w:r>
-      <w:proofErr w:type="spellEnd"/>
-      <w:r>
-        <w:rPr>
-          <w:rFonts w:ascii="Consolas" w:eastAsia="Times New Roman" w:hAnsi="Consolas" w:cs="Times New Roman"/>
-          <w:sz w:val="20"/>
-          <w:szCs w:val="20"/>
-          <w:lang w:val="en-US" w:eastAsia="de-DE"/>
-        </w:rPr>
-        <w:t>-resources</w:t>
+        <w:t>kubectl api-resources</w:t>
       </w:r>
     </w:p>
     <w:p>
@@ -984,7 +817,6 @@
           <w:lang w:val="en-US" w:eastAsia="de-DE"/>
         </w:rPr>
       </w:pPr>
-      <w:proofErr w:type="spellStart"/>
       <w:r>
         <w:rPr>
           <w:rFonts w:ascii="Consolas" w:eastAsia="Times New Roman" w:hAnsi="Consolas" w:cs="Courier New"/>
@@ -993,65 +825,8 @@
           <w:szCs w:val="20"/>
           <w:lang w:val="en-US" w:eastAsia="de-DE"/>
         </w:rPr>
-        <w:t>kubectl</w:t>
-      </w:r>
-      <w:proofErr w:type="spellEnd"/>
-      <w:r>
-        <w:rPr>
-          <w:rFonts w:ascii="Consolas" w:eastAsia="Times New Roman" w:hAnsi="Consolas" w:cs="Courier New"/>
-          <w:color w:val="24292E"/>
-          <w:sz w:val="20"/>
-          <w:szCs w:val="20"/>
-          <w:lang w:val="en-US" w:eastAsia="de-DE"/>
-        </w:rPr>
-        <w:t xml:space="preserve"> get </w:t>
-      </w:r>
-      <w:proofErr w:type="spellStart"/>
-      <w:proofErr w:type="gramStart"/>
-      <w:r>
-        <w:rPr>
-          <w:rFonts w:ascii="Consolas" w:eastAsia="Times New Roman" w:hAnsi="Consolas" w:cs="Courier New"/>
-          <w:color w:val="24292E"/>
-          <w:sz w:val="20"/>
-          <w:szCs w:val="20"/>
-          <w:lang w:val="en-US" w:eastAsia="de-DE"/>
-        </w:rPr>
-        <w:t>svc,pod</w:t>
-      </w:r>
-      <w:proofErr w:type="gramEnd"/>
-      <w:r>
-        <w:rPr>
-          <w:rFonts w:ascii="Consolas" w:eastAsia="Times New Roman" w:hAnsi="Consolas" w:cs="Courier New"/>
-          <w:color w:val="24292E"/>
-          <w:sz w:val="20"/>
-          <w:szCs w:val="20"/>
-          <w:lang w:val="en-US" w:eastAsia="de-DE"/>
-        </w:rPr>
-        <w:t>,deploy</w:t>
-      </w:r>
-      <w:proofErr w:type="spellEnd"/>
-      <w:r>
-        <w:rPr>
-          <w:rFonts w:ascii="Consolas" w:eastAsia="Times New Roman" w:hAnsi="Consolas" w:cs="Courier New"/>
-          <w:color w:val="24292E"/>
-          <w:sz w:val="20"/>
-          <w:szCs w:val="20"/>
-          <w:lang w:val="en-US" w:eastAsia="de-DE"/>
-        </w:rPr>
-        <w:t xml:space="preserve"> -l name=</w:t>
-      </w:r>
-      <w:proofErr w:type="spellStart"/>
-      <w:r>
-        <w:rPr>
-          <w:rFonts w:ascii="Consolas" w:eastAsia="Times New Roman" w:hAnsi="Consolas" w:cs="Courier New"/>
-          <w:color w:val="24292E"/>
-          <w:sz w:val="20"/>
-          <w:szCs w:val="20"/>
-          <w:lang w:val="en-US" w:eastAsia="de-DE"/>
-        </w:rPr>
-        <w:t>nginx</w:t>
-      </w:r>
-      <w:proofErr w:type="spellEnd"/>
+        <w:t>kubectl get svc,pod,deploy -l name=nginx</w:t>
+      </w:r>
       <w:r>
         <w:rPr>
           <w:rFonts w:ascii="Segoe UI" w:eastAsia="Times New Roman" w:hAnsi="Segoe UI" w:cs="Segoe UI"/>
@@ -1109,7 +884,6 @@
           <w:lang w:val="en-US" w:eastAsia="de-DE"/>
         </w:rPr>
       </w:pPr>
-      <w:proofErr w:type="spellStart"/>
       <w:r>
         <w:rPr>
           <w:rFonts w:ascii="Consolas" w:eastAsia="Times New Roman" w:hAnsi="Consolas" w:cs="Times New Roman"/>
@@ -1117,9 +891,17 @@
           <w:szCs w:val="20"/>
           <w:lang w:val="en-US" w:eastAsia="de-DE"/>
         </w:rPr>
-        <w:t>kubectl</w:t>
-      </w:r>
-      <w:proofErr w:type="spellEnd"/>
+        <w:t xml:space="preserve">kubectl explain &lt;resource&gt; </w:t>
+      </w:r>
+      <w:r>
+        <w:rPr>
+          <w:rFonts w:ascii="Segoe UI" w:eastAsia="Times New Roman" w:hAnsi="Segoe UI" w:cs="Segoe UI"/>
+          <w:sz w:val="20"/>
+          <w:szCs w:val="20"/>
+          <w:lang w:val="en-US" w:eastAsia="de-DE"/>
+        </w:rPr>
+        <w:t>will give you a description of the specified resource. To get more details append the field name to the resource like this:</w:t>
+      </w:r>
       <w:r>
         <w:rPr>
           <w:rFonts w:ascii="Consolas" w:eastAsia="Times New Roman" w:hAnsi="Consolas" w:cs="Times New Roman"/>
@@ -1127,59 +909,8 @@
           <w:szCs w:val="20"/>
           <w:lang w:val="en-US" w:eastAsia="de-DE"/>
         </w:rPr>
-        <w:t xml:space="preserve"> explain &lt;resource&gt; </w:t>
-      </w:r>
-      <w:r>
-        <w:rPr>
-          <w:rFonts w:ascii="Segoe UI" w:eastAsia="Times New Roman" w:hAnsi="Segoe UI" w:cs="Segoe UI"/>
-          <w:sz w:val="20"/>
-          <w:szCs w:val="20"/>
-          <w:lang w:val="en-US" w:eastAsia="de-DE"/>
-        </w:rPr>
-        <w:t>will give you a description of the specified resource. To get more details append the field name to the resource like this:</w:t>
-      </w:r>
-      <w:r>
-        <w:rPr>
-          <w:rFonts w:ascii="Consolas" w:eastAsia="Times New Roman" w:hAnsi="Consolas" w:cs="Times New Roman"/>
-          <w:sz w:val="20"/>
-          <w:szCs w:val="20"/>
-          <w:lang w:val="en-US" w:eastAsia="de-DE"/>
-        </w:rPr>
-        <w:t xml:space="preserve">            </w:t>
-      </w:r>
-      <w:proofErr w:type="spellStart"/>
-      <w:r>
-        <w:rPr>
-          <w:rFonts w:ascii="Consolas" w:eastAsia="Times New Roman" w:hAnsi="Consolas" w:cs="Times New Roman"/>
-          <w:sz w:val="20"/>
-          <w:szCs w:val="20"/>
-          <w:lang w:val="en-US" w:eastAsia="de-DE"/>
-        </w:rPr>
-        <w:t>kubectl</w:t>
-      </w:r>
-      <w:proofErr w:type="spellEnd"/>
-      <w:r>
-        <w:rPr>
-          <w:rFonts w:ascii="Consolas" w:eastAsia="Times New Roman" w:hAnsi="Consolas" w:cs="Times New Roman"/>
-          <w:sz w:val="20"/>
-          <w:szCs w:val="20"/>
-          <w:lang w:val="en-US" w:eastAsia="de-DE"/>
-        </w:rPr>
-        <w:t xml:space="preserve"> explain </w:t>
-      </w:r>
-      <w:proofErr w:type="spellStart"/>
-      <w:proofErr w:type="gramStart"/>
-      <w:r>
-        <w:rPr>
-          <w:rFonts w:ascii="Consolas" w:eastAsia="Times New Roman" w:hAnsi="Consolas" w:cs="Times New Roman"/>
-          <w:sz w:val="20"/>
-          <w:szCs w:val="20"/>
-          <w:lang w:val="en-US" w:eastAsia="de-DE"/>
-        </w:rPr>
-        <w:t>pod.spec</w:t>
-      </w:r>
-      <w:proofErr w:type="spellEnd"/>
-      <w:proofErr w:type="gramEnd"/>
+        <w:t xml:space="preserve">            kubectl explain pod.spec</w:t>
+      </w:r>
     </w:p>
     <w:p>
       <w:pPr>
@@ -1222,27 +953,7 @@
           <w:szCs w:val="20"/>
           <w:lang w:val="en-US" w:eastAsia="de-DE"/>
         </w:rPr>
-        <w:t xml:space="preserve"> </w:t>
-      </w:r>
-      <w:proofErr w:type="spellStart"/>
-      <w:r>
-        <w:rPr>
-          <w:rFonts w:ascii="Consolas" w:eastAsia="Times New Roman" w:hAnsi="Consolas" w:cs="Times New Roman"/>
-          <w:sz w:val="20"/>
-          <w:szCs w:val="20"/>
-          <w:lang w:val="en-US" w:eastAsia="de-DE"/>
-        </w:rPr>
-        <w:t>kubectl</w:t>
-      </w:r>
-      <w:proofErr w:type="spellEnd"/>
-      <w:r>
-        <w:rPr>
-          <w:rFonts w:ascii="Consolas" w:eastAsia="Times New Roman" w:hAnsi="Consolas" w:cs="Times New Roman"/>
-          <w:sz w:val="20"/>
-          <w:szCs w:val="20"/>
-          <w:lang w:val="en-US" w:eastAsia="de-DE"/>
-        </w:rPr>
-        <w:t xml:space="preserve"> </w:t>
+        <w:t xml:space="preserve"> kubectl </w:t>
       </w:r>
       <w:r>
         <w:rPr>
@@ -1270,7 +981,6 @@
           <w:lang w:val="en-US" w:eastAsia="de-DE"/>
         </w:rPr>
       </w:pPr>
-      <w:proofErr w:type="spellStart"/>
       <w:r>
         <w:rPr>
           <w:rFonts w:ascii="Consolas" w:eastAsia="Times New Roman" w:hAnsi="Consolas" w:cs="Times New Roman"/>
@@ -1278,17 +988,7 @@
           <w:szCs w:val="20"/>
           <w:lang w:val="en-US" w:eastAsia="de-DE"/>
         </w:rPr>
-        <w:t>kubectl</w:t>
-      </w:r>
-      <w:proofErr w:type="spellEnd"/>
-      <w:r>
-        <w:rPr>
-          <w:rFonts w:ascii="Consolas" w:eastAsia="Times New Roman" w:hAnsi="Consolas" w:cs="Times New Roman"/>
-          <w:sz w:val="20"/>
-          <w:szCs w:val="20"/>
-          <w:lang w:val="en-US" w:eastAsia="de-DE"/>
-        </w:rPr>
-        <w:t xml:space="preserve"> diff -f &lt;file&gt; </w:t>
+        <w:t xml:space="preserve">kubectl diff -f &lt;file&gt; </w:t>
       </w:r>
       <w:r>
         <w:rPr>
@@ -1348,33 +1048,7 @@
           <w:lang w:val="en-US" w:eastAsia="de-DE"/>
         </w:rPr>
         <w:lastRenderedPageBreak/>
-        <w:t xml:space="preserve">most common </w:t>
-      </w:r>
-      <w:proofErr w:type="spellStart"/>
-      <w:r>
-        <w:rPr>
-          <w:rFonts w:ascii="Segoe UI" w:eastAsia="Times New Roman" w:hAnsi="Segoe UI" w:cs="Segoe UI"/>
-          <w:b/>
-          <w:bCs/>
-          <w:color w:val="24292E"/>
-          <w:sz w:val="32"/>
-          <w:szCs w:val="36"/>
-          <w:lang w:val="en-US" w:eastAsia="de-DE"/>
-        </w:rPr>
-        <w:t>kubectl</w:t>
-      </w:r>
-      <w:proofErr w:type="spellEnd"/>
-      <w:r>
-        <w:rPr>
-          <w:rFonts w:ascii="Segoe UI" w:eastAsia="Times New Roman" w:hAnsi="Segoe UI" w:cs="Segoe UI"/>
-          <w:b/>
-          <w:bCs/>
-          <w:color w:val="24292E"/>
-          <w:sz w:val="32"/>
-          <w:szCs w:val="36"/>
-          <w:lang w:val="en-US" w:eastAsia="de-DE"/>
-        </w:rPr>
-        <w:t xml:space="preserve"> commands</w:t>
+        <w:t>most common kubectl commands</w:t>
       </w:r>
     </w:p>
     <w:p>
@@ -1555,7 +1229,6 @@
                 <w:lang w:val="en-US" w:eastAsia="de-DE"/>
               </w:rPr>
             </w:pPr>
-            <w:proofErr w:type="spellStart"/>
             <w:r>
               <w:rPr>
                 <w:rFonts w:ascii="Consolas" w:eastAsia="Times New Roman" w:hAnsi="Consolas" w:cs="Courier New"/>
@@ -1563,17 +1236,7 @@
                 <w:szCs w:val="24"/>
                 <w:lang w:val="en-US" w:eastAsia="de-DE"/>
               </w:rPr>
-              <w:t>kubectl</w:t>
-            </w:r>
-            <w:proofErr w:type="spellEnd"/>
-            <w:r>
-              <w:rPr>
-                <w:rFonts w:ascii="Consolas" w:eastAsia="Times New Roman" w:hAnsi="Consolas" w:cs="Courier New"/>
-                <w:color w:val="24292E"/>
-                <w:szCs w:val="24"/>
-                <w:lang w:val="en-US" w:eastAsia="de-DE"/>
-              </w:rPr>
-              <w:t xml:space="preserve"> get all </w:t>
+              <w:t xml:space="preserve">kubectl get all </w:t>
             </w:r>
           </w:p>
         </w:tc>
@@ -1651,7 +1314,6 @@
                 <w:lang w:val="en-US" w:eastAsia="de-DE"/>
               </w:rPr>
             </w:pPr>
-            <w:proofErr w:type="spellStart"/>
             <w:r>
               <w:rPr>
                 <w:rFonts w:ascii="Consolas" w:eastAsia="Times New Roman" w:hAnsi="Consolas" w:cs="Courier New"/>
@@ -1659,17 +1321,7 @@
                 <w:szCs w:val="24"/>
                 <w:lang w:val="en-US" w:eastAsia="de-DE"/>
               </w:rPr>
-              <w:t>kubectl</w:t>
-            </w:r>
-            <w:proofErr w:type="spellEnd"/>
-            <w:r>
-              <w:rPr>
-                <w:rFonts w:ascii="Consolas" w:eastAsia="Times New Roman" w:hAnsi="Consolas" w:cs="Courier New"/>
-                <w:color w:val="24292E"/>
-                <w:szCs w:val="24"/>
-                <w:lang w:val="en-US" w:eastAsia="de-DE"/>
-              </w:rPr>
-              <w:t xml:space="preserve"> get pods</w:t>
+              <w:t>kubectl get pods</w:t>
             </w:r>
           </w:p>
         </w:tc>
@@ -1747,7 +1399,6 @@
                 <w:lang w:val="en-US" w:eastAsia="de-DE"/>
               </w:rPr>
             </w:pPr>
-            <w:proofErr w:type="spellStart"/>
             <w:r>
               <w:rPr>
                 <w:rFonts w:ascii="Consolas" w:eastAsia="Times New Roman" w:hAnsi="Consolas" w:cs="Courier New"/>
@@ -1755,17 +1406,7 @@
                 <w:szCs w:val="24"/>
                 <w:lang w:val="en-US" w:eastAsia="de-DE"/>
               </w:rPr>
-              <w:t>kubectl</w:t>
-            </w:r>
-            <w:proofErr w:type="spellEnd"/>
-            <w:r>
-              <w:rPr>
-                <w:rFonts w:ascii="Consolas" w:eastAsia="Times New Roman" w:hAnsi="Consolas" w:cs="Courier New"/>
-                <w:color w:val="24292E"/>
-                <w:szCs w:val="24"/>
-                <w:lang w:val="en-US" w:eastAsia="de-DE"/>
-              </w:rPr>
-              <w:t xml:space="preserve"> get pods </w:t>
+              <w:t xml:space="preserve">kubectl get pods </w:t>
             </w:r>
           </w:p>
           <w:p>
@@ -1863,7 +1504,6 @@
                 <w:lang w:val="en-US" w:eastAsia="de-DE"/>
               </w:rPr>
             </w:pPr>
-            <w:proofErr w:type="spellStart"/>
             <w:r>
               <w:rPr>
                 <w:rFonts w:ascii="Consolas" w:eastAsia="Times New Roman" w:hAnsi="Consolas" w:cs="Courier New"/>
@@ -1871,17 +1511,7 @@
                 <w:szCs w:val="24"/>
                 <w:lang w:val="en-US" w:eastAsia="de-DE"/>
               </w:rPr>
-              <w:t>kubectl</w:t>
-            </w:r>
-            <w:proofErr w:type="spellEnd"/>
-            <w:r>
-              <w:rPr>
-                <w:rFonts w:ascii="Consolas" w:eastAsia="Times New Roman" w:hAnsi="Consolas" w:cs="Courier New"/>
-                <w:color w:val="24292E"/>
-                <w:szCs w:val="24"/>
-                <w:lang w:val="en-US" w:eastAsia="de-DE"/>
-              </w:rPr>
-              <w:t xml:space="preserve"> get pods my-pod</w:t>
+              <w:t>kubectl get pods my-pod</w:t>
             </w:r>
           </w:p>
         </w:tc>
@@ -1968,7 +1598,6 @@
                 <w:lang w:val="en-US" w:eastAsia="de-DE"/>
               </w:rPr>
             </w:pPr>
-            <w:proofErr w:type="spellStart"/>
             <w:r>
               <w:rPr>
                 <w:rFonts w:ascii="Consolas" w:eastAsia="Times New Roman" w:hAnsi="Consolas" w:cs="Courier New"/>
@@ -1976,17 +1605,7 @@
                 <w:szCs w:val="24"/>
                 <w:lang w:val="en-US" w:eastAsia="de-DE"/>
               </w:rPr>
-              <w:t>kubectl</w:t>
-            </w:r>
-            <w:proofErr w:type="spellEnd"/>
-            <w:r>
-              <w:rPr>
-                <w:rFonts w:ascii="Consolas" w:eastAsia="Times New Roman" w:hAnsi="Consolas" w:cs="Courier New"/>
-                <w:color w:val="24292E"/>
-                <w:szCs w:val="24"/>
-                <w:lang w:val="en-US" w:eastAsia="de-DE"/>
-              </w:rPr>
-              <w:t xml:space="preserve"> get pods -l status=awesome</w:t>
+              <w:t>kubectl get pods -l status=awesome</w:t>
             </w:r>
           </w:p>
         </w:tc>
@@ -2064,7 +1683,6 @@
                 <w:lang w:val="en-US" w:eastAsia="de-DE"/>
               </w:rPr>
             </w:pPr>
-            <w:proofErr w:type="spellStart"/>
             <w:r>
               <w:rPr>
                 <w:rFonts w:ascii="Consolas" w:eastAsia="Times New Roman" w:hAnsi="Consolas" w:cs="Courier New"/>
@@ -2072,17 +1690,7 @@
                 <w:szCs w:val="24"/>
                 <w:lang w:val="en-US" w:eastAsia="de-DE"/>
               </w:rPr>
-              <w:t>kubectl</w:t>
-            </w:r>
-            <w:proofErr w:type="spellEnd"/>
-            <w:r>
-              <w:rPr>
-                <w:rFonts w:ascii="Consolas" w:eastAsia="Times New Roman" w:hAnsi="Consolas" w:cs="Courier New"/>
-                <w:color w:val="24292E"/>
-                <w:szCs w:val="24"/>
-                <w:lang w:val="en-US" w:eastAsia="de-DE"/>
-              </w:rPr>
-              <w:t xml:space="preserve"> describe pod </w:t>
+              <w:t xml:space="preserve">kubectl describe pod </w:t>
             </w:r>
           </w:p>
           <w:p>
@@ -2142,27 +1750,7 @@
                 <w:szCs w:val="24"/>
                 <w:lang w:val="en-US" w:eastAsia="de-DE"/>
               </w:rPr>
-              <w:t xml:space="preserve">gives a detailed description of the </w:t>
-            </w:r>
-            <w:proofErr w:type="spellStart"/>
-            <w:r>
-              <w:rPr>
-                <w:rFonts w:ascii="Segoe UI" w:eastAsia="Times New Roman" w:hAnsi="Segoe UI" w:cs="Segoe UI"/>
-                <w:color w:val="24292E"/>
-                <w:szCs w:val="24"/>
-                <w:lang w:val="en-US" w:eastAsia="de-DE"/>
-              </w:rPr>
-              <w:t>the</w:t>
-            </w:r>
-            <w:proofErr w:type="spellEnd"/>
-            <w:r>
-              <w:rPr>
-                <w:rFonts w:ascii="Segoe UI" w:eastAsia="Times New Roman" w:hAnsi="Segoe UI" w:cs="Segoe UI"/>
-                <w:color w:val="24292E"/>
-                <w:szCs w:val="24"/>
-                <w:lang w:val="en-US" w:eastAsia="de-DE"/>
-              </w:rPr>
-              <w:t xml:space="preserve"> pod </w:t>
+              <w:t>gives a detailed description of the the pod </w:t>
             </w:r>
             <w:r>
               <w:rPr>
@@ -2218,7 +1806,6 @@
                 <w:lang w:val="en-US" w:eastAsia="de-DE"/>
               </w:rPr>
             </w:pPr>
-            <w:proofErr w:type="spellStart"/>
             <w:r>
               <w:rPr>
                 <w:rFonts w:ascii="Consolas" w:eastAsia="Times New Roman" w:hAnsi="Consolas" w:cs="Courier New"/>
@@ -2226,31 +1813,8 @@
                 <w:szCs w:val="24"/>
                 <w:lang w:val="en-US" w:eastAsia="de-DE"/>
               </w:rPr>
-              <w:t>kubectl</w:t>
-            </w:r>
-            <w:proofErr w:type="spellEnd"/>
-            <w:r>
-              <w:rPr>
-                <w:rFonts w:ascii="Consolas" w:eastAsia="Times New Roman" w:hAnsi="Consolas" w:cs="Courier New"/>
-                <w:color w:val="24292E"/>
-                <w:szCs w:val="24"/>
-                <w:lang w:val="en-US" w:eastAsia="de-DE"/>
-              </w:rPr>
-              <w:t xml:space="preserve"> create -f </w:t>
-            </w:r>
-            <w:proofErr w:type="spellStart"/>
-            <w:proofErr w:type="gramStart"/>
-            <w:r>
-              <w:rPr>
-                <w:rFonts w:ascii="Consolas" w:eastAsia="Times New Roman" w:hAnsi="Consolas" w:cs="Courier New"/>
-                <w:color w:val="24292E"/>
-                <w:szCs w:val="24"/>
-                <w:lang w:val="en-US" w:eastAsia="de-DE"/>
-              </w:rPr>
-              <w:t>pod.yaml</w:t>
-            </w:r>
-            <w:proofErr w:type="spellEnd"/>
-            <w:proofErr w:type="gramEnd"/>
+              <w:t>kubectl create -f pod.yaml</w:t>
+            </w:r>
           </w:p>
         </w:tc>
         <w:tc>
@@ -2289,29 +1853,8 @@
                 <w:szCs w:val="24"/>
                 <w:lang w:val="en-US" w:eastAsia="de-DE"/>
               </w:rPr>
-              <w:t xml:space="preserve">create </w:t>
-            </w:r>
-            <w:proofErr w:type="gramStart"/>
-            <w:r>
-              <w:rPr>
-                <w:rFonts w:ascii="Segoe UI" w:eastAsia="Times New Roman" w:hAnsi="Segoe UI" w:cs="Segoe UI"/>
-                <w:color w:val="24292E"/>
-                <w:szCs w:val="24"/>
-                <w:lang w:val="en-US" w:eastAsia="de-DE"/>
-              </w:rPr>
-              <w:t>1..</w:t>
-            </w:r>
-            <w:proofErr w:type="gramEnd"/>
-            <w:r>
-              <w:rPr>
-                <w:rFonts w:ascii="Segoe UI" w:eastAsia="Times New Roman" w:hAnsi="Segoe UI" w:cs="Segoe UI"/>
-                <w:color w:val="24292E"/>
-                <w:szCs w:val="24"/>
-                <w:lang w:val="en-US" w:eastAsia="de-DE"/>
-              </w:rPr>
-              <w:t>n resources that are specified in the </w:t>
-            </w:r>
-            <w:proofErr w:type="spellStart"/>
+              <w:t>create 1..n resources that are specified in the </w:t>
+            </w:r>
             <w:r>
               <w:rPr>
                 <w:rFonts w:ascii="Consolas" w:eastAsia="Times New Roman" w:hAnsi="Consolas" w:cs="Courier New"/>
@@ -2321,7 +1864,6 @@
               </w:rPr>
               <w:t>pod.yaml</w:t>
             </w:r>
-            <w:proofErr w:type="spellEnd"/>
             <w:r>
               <w:rPr>
                 <w:rFonts w:ascii="Segoe UI" w:eastAsia="Times New Roman" w:hAnsi="Segoe UI" w:cs="Segoe UI"/>
@@ -2367,7 +1909,6 @@
                 <w:lang w:val="en-US" w:eastAsia="de-DE"/>
               </w:rPr>
             </w:pPr>
-            <w:proofErr w:type="spellStart"/>
             <w:r>
               <w:rPr>
                 <w:rFonts w:ascii="Consolas" w:eastAsia="Times New Roman" w:hAnsi="Consolas" w:cs="Courier New"/>
@@ -2375,17 +1916,7 @@
                 <w:szCs w:val="24"/>
                 <w:lang w:val="en-US" w:eastAsia="de-DE"/>
               </w:rPr>
-              <w:t>kubectl</w:t>
-            </w:r>
-            <w:proofErr w:type="spellEnd"/>
-            <w:r>
-              <w:rPr>
-                <w:rFonts w:ascii="Consolas" w:eastAsia="Times New Roman" w:hAnsi="Consolas" w:cs="Courier New"/>
-                <w:color w:val="24292E"/>
-                <w:szCs w:val="24"/>
-                <w:lang w:val="en-US" w:eastAsia="de-DE"/>
-              </w:rPr>
-              <w:t xml:space="preserve"> logs my-pod</w:t>
+              <w:t>kubectl logs my-pod</w:t>
             </w:r>
           </w:p>
         </w:tc>
@@ -2472,7 +2003,6 @@
                 <w:lang w:val="en-US" w:eastAsia="de-DE"/>
               </w:rPr>
             </w:pPr>
-            <w:proofErr w:type="spellStart"/>
             <w:r>
               <w:rPr>
                 <w:rFonts w:ascii="Consolas" w:eastAsia="Times New Roman" w:hAnsi="Consolas" w:cs="Courier New"/>
@@ -2480,17 +2010,7 @@
                 <w:szCs w:val="24"/>
                 <w:lang w:val="en-US" w:eastAsia="de-DE"/>
               </w:rPr>
-              <w:t>kubectl</w:t>
-            </w:r>
-            <w:proofErr w:type="spellEnd"/>
-            <w:r>
-              <w:rPr>
-                <w:rFonts w:ascii="Consolas" w:eastAsia="Times New Roman" w:hAnsi="Consolas" w:cs="Courier New"/>
-                <w:color w:val="24292E"/>
-                <w:szCs w:val="24"/>
-                <w:lang w:val="en-US" w:eastAsia="de-DE"/>
-              </w:rPr>
-              <w:t xml:space="preserve"> exec -it </w:t>
+              <w:t xml:space="preserve">kubectl exec -it </w:t>
             </w:r>
           </w:p>
           <w:p>
@@ -2615,7 +2135,6 @@
                 <w:lang w:val="en-US" w:eastAsia="de-DE"/>
               </w:rPr>
             </w:pPr>
-            <w:proofErr w:type="spellStart"/>
             <w:r>
               <w:rPr>
                 <w:rFonts w:ascii="Consolas" w:eastAsia="Times New Roman" w:hAnsi="Consolas" w:cs="Courier New"/>
@@ -2623,17 +2142,7 @@
                 <w:szCs w:val="24"/>
                 <w:lang w:val="en-US" w:eastAsia="de-DE"/>
               </w:rPr>
-              <w:t>kubectl</w:t>
-            </w:r>
-            <w:proofErr w:type="spellEnd"/>
-            <w:r>
-              <w:rPr>
-                <w:rFonts w:ascii="Consolas" w:eastAsia="Times New Roman" w:hAnsi="Consolas" w:cs="Courier New"/>
-                <w:color w:val="24292E"/>
-                <w:szCs w:val="24"/>
-                <w:lang w:val="en-US" w:eastAsia="de-DE"/>
-              </w:rPr>
-              <w:t xml:space="preserve"> label pod my-pod status=awesome</w:t>
+              <w:t>kubectl label pod my-pod status=awesome</w:t>
             </w:r>
           </w:p>
         </w:tc>
@@ -2673,27 +2182,7 @@
                 <w:szCs w:val="24"/>
                 <w:lang w:val="en-US" w:eastAsia="de-DE"/>
               </w:rPr>
-              <w:t xml:space="preserve">attaches a </w:t>
-            </w:r>
-            <w:proofErr w:type="spellStart"/>
-            <w:r>
-              <w:rPr>
-                <w:rFonts w:ascii="Segoe UI" w:eastAsia="Times New Roman" w:hAnsi="Segoe UI" w:cs="Segoe UI"/>
-                <w:color w:val="24292E"/>
-                <w:szCs w:val="24"/>
-                <w:lang w:val="en-US" w:eastAsia="de-DE"/>
-              </w:rPr>
-              <w:t>lable</w:t>
-            </w:r>
-            <w:proofErr w:type="spellEnd"/>
-            <w:r>
-              <w:rPr>
-                <w:rFonts w:ascii="Segoe UI" w:eastAsia="Times New Roman" w:hAnsi="Segoe UI" w:cs="Segoe UI"/>
-                <w:color w:val="24292E"/>
-                <w:szCs w:val="24"/>
-                <w:lang w:val="en-US" w:eastAsia="de-DE"/>
-              </w:rPr>
-              <w:t> </w:t>
+              <w:t>attaches a lable </w:t>
             </w:r>
             <w:r>
               <w:rPr>
@@ -2749,7 +2238,6 @@
                 <w:lang w:val="en-US" w:eastAsia="de-DE"/>
               </w:rPr>
             </w:pPr>
-            <w:proofErr w:type="spellStart"/>
             <w:r>
               <w:rPr>
                 <w:rFonts w:ascii="Consolas" w:eastAsia="Times New Roman" w:hAnsi="Consolas" w:cs="Courier New"/>
@@ -2757,17 +2245,7 @@
                 <w:szCs w:val="24"/>
                 <w:lang w:val="en-US" w:eastAsia="de-DE"/>
               </w:rPr>
-              <w:t>kubectl</w:t>
-            </w:r>
-            <w:proofErr w:type="spellEnd"/>
-            <w:r>
-              <w:rPr>
-                <w:rFonts w:ascii="Consolas" w:eastAsia="Times New Roman" w:hAnsi="Consolas" w:cs="Courier New"/>
-                <w:color w:val="24292E"/>
-                <w:szCs w:val="24"/>
-                <w:lang w:val="en-US" w:eastAsia="de-DE"/>
-              </w:rPr>
-              <w:t xml:space="preserve"> delete pod my-pod</w:t>
+              <w:t>kubectl delete pod my-pod</w:t>
             </w:r>
           </w:p>
         </w:tc>
@@ -2918,31 +2396,7 @@
           <w:szCs w:val="24"/>
           <w:lang w:val="en-US" w:eastAsia="de-DE"/>
         </w:rPr>
-        <w:t xml:space="preserve">specified in your </w:t>
-      </w:r>
-      <w:proofErr w:type="spellStart"/>
-      <w:r>
-        <w:rPr>
-          <w:rFonts w:ascii="Segoe UI" w:eastAsia="Times New Roman" w:hAnsi="Segoe UI" w:cs="Segoe UI"/>
-          <w:b/>
-          <w:bCs/>
-          <w:color w:val="24292E"/>
-          <w:szCs w:val="24"/>
-          <w:lang w:val="en-US" w:eastAsia="de-DE"/>
-        </w:rPr>
-        <w:t>kubeconfig</w:t>
-      </w:r>
-      <w:proofErr w:type="spellEnd"/>
-      <w:r>
-        <w:rPr>
-          <w:rFonts w:ascii="Segoe UI" w:eastAsia="Times New Roman" w:hAnsi="Segoe UI" w:cs="Segoe UI"/>
-          <w:b/>
-          <w:bCs/>
-          <w:color w:val="24292E"/>
-          <w:szCs w:val="24"/>
-          <w:lang w:val="en-US" w:eastAsia="de-DE"/>
-        </w:rPr>
-        <w:t>.</w:t>
+        <w:t>specified in your kubeconfig.</w:t>
       </w:r>
     </w:p>
     <w:p>
@@ -2963,8 +2417,58 @@
 </w:document>
 </file>
 
+<file path=word/endnotes.xml><?xml version="1.0" encoding="utf-8"?>
+<w:endnotes xmlns:wpc="http://schemas.microsoft.com/office/word/2010/wordprocessingCanvas" xmlns:cx="http://schemas.microsoft.com/office/drawing/2014/chartex" xmlns:cx1="http://schemas.microsoft.com/office/drawing/2015/9/8/chartex" xmlns:cx2="http://schemas.microsoft.com/office/drawing/2015/10/21/chartex" xmlns:cx3="http://schemas.microsoft.com/office/drawing/2016/5/9/chartex" xmlns:cx4="http://schemas.microsoft.com/office/drawing/2016/5/10/chartex" xmlns:cx5="http://schemas.microsoft.com/office/drawing/2016/5/11/chartex" xmlns:cx6="http://schemas.microsoft.com/office/drawing/2016/5/12/chartex" xmlns:cx7="http://schemas.microsoft.com/office/drawing/2016/5/13/chartex" xmlns:cx8="http://schemas.microsoft.com/office/drawing/2016/5/14/chartex" xmlns:mc="http://schemas.openxmlformats.org/markup-compatibility/2006" xmlns:aink="http://schemas.microsoft.com/office/drawing/2016/ink" xmlns:am3d="http://schemas.microsoft.com/office/drawing/2017/model3d" xmlns:o="urn:schemas-microsoft-com:office:office" xmlns:oel="http://schemas.microsoft.com/office/2019/extlst" xmlns:r="http://schemas.openxmlformats.org/officeDocument/2006/relationships" xmlns:m="http://schemas.openxmlformats.org/officeDocument/2006/math" xmlns:v="urn:schemas-microsoft-com:vml" xmlns:wp14="http://schemas.microsoft.com/office/word/2010/wordprocessingDrawing" xmlns:wp="http://schemas.openxmlformats.org/drawingml/2006/wordprocessingDrawing" xmlns:w10="urn:schemas-microsoft-com:office:word" xmlns:w="http://schemas.openxmlformats.org/wordprocessingml/2006/main" xmlns:w14="http://schemas.microsoft.com/office/word/2010/wordml" xmlns:w15="http://schemas.microsoft.com/office/word/2012/wordml" xmlns:w16cex="http://schemas.microsoft.com/office/word/2018/wordml/cex" xmlns:w16cid="http://schemas.microsoft.com/office/word/2016/wordml/cid" xmlns:w16="http://schemas.microsoft.com/office/word/2018/wordml" xmlns:w16sdtdh="http://schemas.microsoft.com/office/word/2020/wordml/sdtdatahash" xmlns:w16se="http://schemas.microsoft.com/office/word/2015/wordml/symex" xmlns:wpg="http://schemas.microsoft.com/office/word/2010/wordprocessingGroup" xmlns:wpi="http://schemas.microsoft.com/office/word/2010/wordprocessingInk" xmlns:wne="http://schemas.microsoft.com/office/word/2006/wordml" xmlns:wps="http://schemas.microsoft.com/office/word/2010/wordprocessingShape" mc:Ignorable="w14 w15 w16se w16cid w16 w16cex w16sdtdh wp14">
+  <w:endnote w:type="separator" w:id="-1">
+    <w:p>
+      <w:pPr>
+        <w:spacing w:after="0" w:line="240" w:lineRule="auto"/>
+      </w:pPr>
+      <w:r>
+        <w:separator/>
+      </w:r>
+    </w:p>
+  </w:endnote>
+  <w:endnote w:type="continuationSeparator" w:id="0">
+    <w:p>
+      <w:pPr>
+        <w:spacing w:after="0" w:line="240" w:lineRule="auto"/>
+      </w:pPr>
+      <w:r>
+        <w:continuationSeparator/>
+      </w:r>
+    </w:p>
+  </w:endnote>
+</w:endnotes>
+</file>
+
+<file path=word/footnotes.xml><?xml version="1.0" encoding="utf-8"?>
+<w:footnotes xmlns:wpc="http://schemas.microsoft.com/office/word/2010/wordprocessingCanvas" xmlns:cx="http://schemas.microsoft.com/office/drawing/2014/chartex" xmlns:cx1="http://schemas.microsoft.com/office/drawing/2015/9/8/chartex" xmlns:cx2="http://schemas.microsoft.com/office/drawing/2015/10/21/chartex" xmlns:cx3="http://schemas.microsoft.com/office/drawing/2016/5/9/chartex" xmlns:cx4="http://schemas.microsoft.com/office/drawing/2016/5/10/chartex" xmlns:cx5="http://schemas.microsoft.com/office/drawing/2016/5/11/chartex" xmlns:cx6="http://schemas.microsoft.com/office/drawing/2016/5/12/chartex" xmlns:cx7="http://schemas.microsoft.com/office/drawing/2016/5/13/chartex" xmlns:cx8="http://schemas.microsoft.com/office/drawing/2016/5/14/chartex" xmlns:mc="http://schemas.openxmlformats.org/markup-compatibility/2006" xmlns:aink="http://schemas.microsoft.com/office/drawing/2016/ink" xmlns:am3d="http://schemas.microsoft.com/office/drawing/2017/model3d" xmlns:o="urn:schemas-microsoft-com:office:office" xmlns:oel="http://schemas.microsoft.com/office/2019/extlst" xmlns:r="http://schemas.openxmlformats.org/officeDocument/2006/relationships" xmlns:m="http://schemas.openxmlformats.org/officeDocument/2006/math" xmlns:v="urn:schemas-microsoft-com:vml" xmlns:wp14="http://schemas.microsoft.com/office/word/2010/wordprocessingDrawing" xmlns:wp="http://schemas.openxmlformats.org/drawingml/2006/wordprocessingDrawing" xmlns:w10="urn:schemas-microsoft-com:office:word" xmlns:w="http://schemas.openxmlformats.org/wordprocessingml/2006/main" xmlns:w14="http://schemas.microsoft.com/office/word/2010/wordml" xmlns:w15="http://schemas.microsoft.com/office/word/2012/wordml" xmlns:w16cex="http://schemas.microsoft.com/office/word/2018/wordml/cex" xmlns:w16cid="http://schemas.microsoft.com/office/word/2016/wordml/cid" xmlns:w16="http://schemas.microsoft.com/office/word/2018/wordml" xmlns:w16sdtdh="http://schemas.microsoft.com/office/word/2020/wordml/sdtdatahash" xmlns:w16se="http://schemas.microsoft.com/office/word/2015/wordml/symex" xmlns:wpg="http://schemas.microsoft.com/office/word/2010/wordprocessingGroup" xmlns:wpi="http://schemas.microsoft.com/office/word/2010/wordprocessingInk" xmlns:wne="http://schemas.microsoft.com/office/word/2006/wordml" xmlns:wps="http://schemas.microsoft.com/office/word/2010/wordprocessingShape" mc:Ignorable="w14 w15 w16se w16cid w16 w16cex w16sdtdh wp14">
+  <w:footnote w:type="separator" w:id="-1">
+    <w:p>
+      <w:pPr>
+        <w:spacing w:after="0" w:line="240" w:lineRule="auto"/>
+      </w:pPr>
+      <w:r>
+        <w:separator/>
+      </w:r>
+    </w:p>
+  </w:footnote>
+  <w:footnote w:type="continuationSeparator" w:id="0">
+    <w:p>
+      <w:pPr>
+        <w:spacing w:after="0" w:line="240" w:lineRule="auto"/>
+      </w:pPr>
+      <w:r>
+        <w:continuationSeparator/>
+      </w:r>
+    </w:p>
+  </w:footnote>
+</w:footnotes>
+</file>
+
 <file path=word/numbering.xml><?xml version="1.0" encoding="utf-8"?>
-<w:numbering xmlns:wpc="http://schemas.microsoft.com/office/word/2010/wordprocessingCanvas" xmlns:cx="http://schemas.microsoft.com/office/drawing/2014/chartex" xmlns:cx1="http://schemas.microsoft.com/office/drawing/2015/9/8/chartex" xmlns:cx2="http://schemas.microsoft.com/office/drawing/2015/10/21/chartex" xmlns:cx3="http://schemas.microsoft.com/office/drawing/2016/5/9/chartex" xmlns:cx4="http://schemas.microsoft.com/office/drawing/2016/5/10/chartex" xmlns:cx5="http://schemas.microsoft.com/office/drawing/2016/5/11/chartex" xmlns:cx6="http://schemas.microsoft.com/office/drawing/2016/5/12/chartex" xmlns:cx7="http://schemas.microsoft.com/office/drawing/2016/5/13/chartex" xmlns:cx8="http://schemas.microsoft.com/office/drawing/2016/5/14/chartex" xmlns:mc="http://schemas.openxmlformats.org/markup-compatibility/2006" xmlns:aink="http://schemas.microsoft.com/office/drawing/2016/ink" xmlns:am3d="http://schemas.microsoft.com/office/drawing/2017/model3d" xmlns:o="urn:schemas-microsoft-com:office:office" xmlns:r="http://schemas.openxmlformats.org/officeDocument/2006/relationships" xmlns:m="http://schemas.openxmlformats.org/officeDocument/2006/math" xmlns:v="urn:schemas-microsoft-com:vml" xmlns:wp14="http://schemas.microsoft.com/office/word/2010/wordprocessingDrawing" xmlns:wp="http://schemas.openxmlformats.org/drawingml/2006/wordprocessingDrawing" xmlns:w10="urn:schemas-microsoft-com:office:word" xmlns:w="http://schemas.openxmlformats.org/wordprocessingml/2006/main" xmlns:w14="http://schemas.microsoft.com/office/word/2010/wordml" xmlns:w15="http://schemas.microsoft.com/office/word/2012/wordml" xmlns:w16cid="http://schemas.microsoft.com/office/word/2016/wordml/cid" xmlns:w16se="http://schemas.microsoft.com/office/word/2015/wordml/symex" xmlns:wpg="http://schemas.microsoft.com/office/word/2010/wordprocessingGroup" xmlns:wpi="http://schemas.microsoft.com/office/word/2010/wordprocessingInk" xmlns:wne="http://schemas.microsoft.com/office/word/2006/wordml" xmlns:wps="http://schemas.microsoft.com/office/word/2010/wordprocessingShape" mc:Ignorable="w14 w15 w16se w16cid wp14">
+<w:numbering xmlns:wpc="http://schemas.microsoft.com/office/word/2010/wordprocessingCanvas" xmlns:cx="http://schemas.microsoft.com/office/drawing/2014/chartex" xmlns:cx1="http://schemas.microsoft.com/office/drawing/2015/9/8/chartex" xmlns:cx2="http://schemas.microsoft.com/office/drawing/2015/10/21/chartex" xmlns:cx3="http://schemas.microsoft.com/office/drawing/2016/5/9/chartex" xmlns:cx4="http://schemas.microsoft.com/office/drawing/2016/5/10/chartex" xmlns:cx5="http://schemas.microsoft.com/office/drawing/2016/5/11/chartex" xmlns:cx6="http://schemas.microsoft.com/office/drawing/2016/5/12/chartex" xmlns:cx7="http://schemas.microsoft.com/office/drawing/2016/5/13/chartex" xmlns:cx8="http://schemas.microsoft.com/office/drawing/2016/5/14/chartex" xmlns:mc="http://schemas.openxmlformats.org/markup-compatibility/2006" xmlns:aink="http://schemas.microsoft.com/office/drawing/2016/ink" xmlns:am3d="http://schemas.microsoft.com/office/drawing/2017/model3d" xmlns:o="urn:schemas-microsoft-com:office:office" xmlns:oel="http://schemas.microsoft.com/office/2019/extlst" xmlns:r="http://schemas.openxmlformats.org/officeDocument/2006/relationships" xmlns:m="http://schemas.openxmlformats.org/officeDocument/2006/math" xmlns:v="urn:schemas-microsoft-com:vml" xmlns:wp14="http://schemas.microsoft.com/office/word/2010/wordprocessingDrawing" xmlns:wp="http://schemas.openxmlformats.org/drawingml/2006/wordprocessingDrawing" xmlns:w10="urn:schemas-microsoft-com:office:word" xmlns:w="http://schemas.openxmlformats.org/wordprocessingml/2006/main" xmlns:w14="http://schemas.microsoft.com/office/word/2010/wordml" xmlns:w15="http://schemas.microsoft.com/office/word/2012/wordml" xmlns:w16cex="http://schemas.microsoft.com/office/word/2018/wordml/cex" xmlns:w16cid="http://schemas.microsoft.com/office/word/2016/wordml/cid" xmlns:w16="http://schemas.microsoft.com/office/word/2018/wordml" xmlns:w16sdtdh="http://schemas.microsoft.com/office/word/2020/wordml/sdtdatahash" xmlns:w16se="http://schemas.microsoft.com/office/word/2015/wordml/symex" xmlns:wpg="http://schemas.microsoft.com/office/word/2010/wordprocessingGroup" xmlns:wpi="http://schemas.microsoft.com/office/word/2010/wordprocessingInk" xmlns:wne="http://schemas.microsoft.com/office/word/2006/wordml" xmlns:wps="http://schemas.microsoft.com/office/word/2010/wordprocessingShape" mc:Ignorable="w14 w15 w16se w16cid w16 w16cex w16sdtdh wp14">
   <w:abstractNum w:abstractNumId="0" w15:restartNumberingAfterBreak="0">
     <w:nsid w:val="3C1D57D4"/>
     <w:multiLevelType w:val="multilevel"/>
@@ -3227,17 +2731,17 @@
       </w:rPr>
     </w:lvl>
   </w:abstractNum>
-  <w:num w:numId="1">
+  <w:num w:numId="1" w16cid:durableId="719209007">
     <w:abstractNumId w:val="0"/>
   </w:num>
-  <w:num w:numId="2">
+  <w:num w:numId="2" w16cid:durableId="1114714352">
     <w:abstractNumId w:val="1"/>
   </w:num>
 </w:numbering>
 </file>
 
 <file path=word/styles.xml><?xml version="1.0" encoding="utf-8"?>
-<w:styles xmlns:mc="http://schemas.openxmlformats.org/markup-compatibility/2006" xmlns:r="http://schemas.openxmlformats.org/officeDocument/2006/relationships" xmlns:w="http://schemas.openxmlformats.org/wordprocessingml/2006/main" xmlns:w14="http://schemas.microsoft.com/office/word/2010/wordml" xmlns:w15="http://schemas.microsoft.com/office/word/2012/wordml" xmlns:w16cid="http://schemas.microsoft.com/office/word/2016/wordml/cid" xmlns:w16se="http://schemas.microsoft.com/office/word/2015/wordml/symex" mc:Ignorable="w14 w15 w16se w16cid">
+<w:styles xmlns:mc="http://schemas.openxmlformats.org/markup-compatibility/2006" xmlns:r="http://schemas.openxmlformats.org/officeDocument/2006/relationships" xmlns:w="http://schemas.openxmlformats.org/wordprocessingml/2006/main" xmlns:w14="http://schemas.microsoft.com/office/word/2010/wordml" xmlns:w15="http://schemas.microsoft.com/office/word/2012/wordml" xmlns:w16cex="http://schemas.microsoft.com/office/word/2018/wordml/cex" xmlns:w16cid="http://schemas.microsoft.com/office/word/2016/wordml/cid" xmlns:w16="http://schemas.microsoft.com/office/word/2018/wordml" xmlns:w16sdtdh="http://schemas.microsoft.com/office/word/2020/wordml/sdtdatahash" xmlns:w16se="http://schemas.microsoft.com/office/word/2015/wordml/symex" mc:Ignorable="w14 w15 w16se w16cid w16 w16cex w16sdtdh">
   <w:docDefaults>
     <w:rPrDefault>
       <w:rPr>
@@ -3253,7 +2757,7 @@
       </w:pPr>
     </w:pPrDefault>
   </w:docDefaults>
-  <w:latentStyles w:defLockedState="0" w:defUIPriority="99" w:defSemiHidden="0" w:defUnhideWhenUsed="0" w:defQFormat="0" w:count="375">
+  <w:latentStyles w:defLockedState="0" w:defUIPriority="99" w:defSemiHidden="0" w:defUnhideWhenUsed="0" w:defQFormat="0" w:count="376">
     <w:lsdException w:name="Normal" w:uiPriority="0" w:qFormat="1"/>
     <w:lsdException w:name="heading 1" w:uiPriority="9" w:qFormat="1"/>
     <w:lsdException w:name="heading 2" w:semiHidden="1" w:uiPriority="9" w:unhideWhenUsed="1" w:qFormat="1"/>
@@ -3359,7 +2863,6 @@
     <w:lsdException w:name="HTML Sample" w:semiHidden="1" w:unhideWhenUsed="1"/>
     <w:lsdException w:name="HTML Typewriter" w:semiHidden="1" w:unhideWhenUsed="1"/>
     <w:lsdException w:name="HTML Variable" w:semiHidden="1" w:unhideWhenUsed="1"/>
-    <w:lsdException w:name="Normal Table" w:semiHidden="1" w:unhideWhenUsed="1"/>
     <w:lsdException w:name="annotation subject" w:semiHidden="1" w:unhideWhenUsed="1"/>
     <w:lsdException w:name="No List" w:semiHidden="1" w:unhideWhenUsed="1"/>
     <w:lsdException w:name="Outline List 1" w:semiHidden="1" w:unhideWhenUsed="1"/>
@@ -3406,10 +2909,8 @@
     <w:lsdException w:name="Table Subtle 2" w:semiHidden="1" w:unhideWhenUsed="1"/>
     <w:lsdException w:name="Table Web 1" w:semiHidden="1" w:unhideWhenUsed="1"/>
     <w:lsdException w:name="Table Web 2" w:semiHidden="1" w:unhideWhenUsed="1"/>
-    <w:lsdException w:name="Table Web 3" w:semiHidden="1" w:unhideWhenUsed="1"/>
     <w:lsdException w:name="Balloon Text" w:semiHidden="1" w:unhideWhenUsed="1"/>
     <w:lsdException w:name="Table Grid" w:uiPriority="39"/>
-    <w:lsdException w:name="Table Theme" w:semiHidden="1" w:unhideWhenUsed="1"/>
     <w:lsdException w:name="Placeholder Text" w:semiHidden="1"/>
     <w:lsdException w:name="No Spacing" w:uiPriority="1" w:qFormat="1"/>
     <w:lsdException w:name="Light Shading" w:uiPriority="60"/>
@@ -3629,6 +3130,7 @@
     <w:lsdException w:name="Smart Hyperlink" w:semiHidden="1" w:unhideWhenUsed="1"/>
     <w:lsdException w:name="Hashtag" w:semiHidden="1" w:unhideWhenUsed="1"/>
     <w:lsdException w:name="Unresolved Mention" w:semiHidden="1" w:unhideWhenUsed="1"/>
+    <w:lsdException w:name="Smart Link" w:semiHidden="1" w:unhideWhenUsed="1"/>
   </w:latentStyles>
   <w:style w:type="paragraph" w:default="1" w:styleId="Normal">
     <w:name w:val="Normal"/>

</xml_diff>